<commit_message>
Update portfolio projects and resume downloads
</commit_message>
<xml_diff>
--- a/Anurag_CP_Java_Full_Stack_Resume.docx
+++ b/Anurag_CP_Java_Full_Stack_Resume.docx
@@ -57,7 +57,15 @@
         <w:jc w:val="center"/>
       </w:pPr>
       <w:r>
-        <w:t xml:space="preserve">+91-8606369544  |  </w:t>
+        <w:t>+91-</w:t>
+      </w:r>
+      <w:proofErr w:type="gramStart"/>
+      <w:r>
+        <w:t>8606369544  |</w:t>
+      </w:r>
+      <w:proofErr w:type="gramEnd"/>
+      <w:r>
+        <w:t xml:space="preserve">  </w:t>
       </w:r>
       <w:hyperlink r:id="rId5" w:history="1">
         <w:r>
@@ -123,16 +131,15 @@
         <w:jc w:val="both"/>
       </w:pPr>
       <w:r>
-        <w:t>Recent Computer Science graduate who enjoys turning ideas into working software. I completed intensive Java full stack training (Core Java, Spring, Hibernate, SQL) and have built projects ranging from a role-based bus reservation system to a machine-learning emotion classifier. I am comfortable across the stack, from REST-style backend logic and relational databases to React and JavaScript interfaces, and I am looking for a Java Developer role where I can write clean code</w:t>
-      </w:r>
-      <w:r>
-        <w:t xml:space="preserve"> and </w:t>
-      </w:r>
-      <w:r>
-        <w:t>keep learning</w:t>
-      </w:r>
-      <w:r>
-        <w:t>.</w:t>
+        <w:t xml:space="preserve">Computer Science graduate who likes building backends that hold up in real use. I trained in Java full stack (Core Java, Spring Boot, Hibernate, SQL) and built </w:t>
+      </w:r>
+      <w:proofErr w:type="spellStart"/>
+      <w:r>
+        <w:t>StockSync</w:t>
+      </w:r>
+      <w:proofErr w:type="spellEnd"/>
+      <w:r>
+        <w:t>, an e-commerce app that prevents overselling with optimistic locking, and a library system with transactional checkouts and FIFO reservations. Looking for a Java Developer role where I can write clean code and keep growing.</w:t>
       </w:r>
     </w:p>
     <w:p>
@@ -207,8 +214,9 @@
           <w:sz w:val="18"/>
           <w:szCs w:val="18"/>
         </w:rPr>
-        <w:t xml:space="preserve">achelor of </w:t>
-      </w:r>
+        <w:t xml:space="preserve">achelor </w:t>
+      </w:r>
+      <w:proofErr w:type="gramStart"/>
       <w:r>
         <w:rPr>
           <w:i/>
@@ -216,7 +224,7 @@
           <w:sz w:val="18"/>
           <w:szCs w:val="18"/>
         </w:rPr>
-        <w:t>Tech</w:t>
+        <w:t xml:space="preserve">of </w:t>
       </w:r>
       <w:r>
         <w:rPr>
@@ -225,7 +233,7 @@
           <w:sz w:val="18"/>
           <w:szCs w:val="18"/>
         </w:rPr>
-        <w:t xml:space="preserve">nology (BE) </w:t>
+        <w:t xml:space="preserve"> </w:t>
       </w:r>
       <w:r>
         <w:rPr>
@@ -234,7 +242,95 @@
           <w:sz w:val="18"/>
           <w:szCs w:val="18"/>
         </w:rPr>
-        <w:t xml:space="preserve"> in Computer Science, APJ Abdul Kalam Technological University (KTU)</w:t>
+        <w:t>Tech</w:t>
+      </w:r>
+      <w:r>
+        <w:rPr>
+          <w:i/>
+          <w:iCs/>
+          <w:sz w:val="18"/>
+          <w:szCs w:val="18"/>
+        </w:rPr>
+        <w:t>nology</w:t>
+      </w:r>
+      <w:proofErr w:type="gramEnd"/>
+      <w:r>
+        <w:rPr>
+          <w:i/>
+          <w:iCs/>
+          <w:sz w:val="18"/>
+          <w:szCs w:val="18"/>
+        </w:rPr>
+        <w:t xml:space="preserve"> (</w:t>
+      </w:r>
+      <w:proofErr w:type="spellStart"/>
+      <w:proofErr w:type="gramStart"/>
+      <w:r>
+        <w:rPr>
+          <w:i/>
+          <w:iCs/>
+          <w:sz w:val="18"/>
+          <w:szCs w:val="18"/>
+        </w:rPr>
+        <w:t>B</w:t>
+      </w:r>
+      <w:r>
+        <w:rPr>
+          <w:i/>
+          <w:iCs/>
+          <w:sz w:val="18"/>
+          <w:szCs w:val="18"/>
+        </w:rPr>
+        <w:t>.Tech</w:t>
+      </w:r>
+      <w:proofErr w:type="spellEnd"/>
+      <w:proofErr w:type="gramEnd"/>
+      <w:r>
+        <w:rPr>
+          <w:i/>
+          <w:iCs/>
+          <w:sz w:val="18"/>
+          <w:szCs w:val="18"/>
+        </w:rPr>
+        <w:t xml:space="preserve"> /</w:t>
+      </w:r>
+      <w:proofErr w:type="gramStart"/>
+      <w:r>
+        <w:rPr>
+          <w:i/>
+          <w:iCs/>
+          <w:sz w:val="18"/>
+          <w:szCs w:val="18"/>
+        </w:rPr>
+        <w:t>BE</w:t>
+      </w:r>
+      <w:r>
+        <w:rPr>
+          <w:i/>
+          <w:iCs/>
+          <w:sz w:val="18"/>
+          <w:szCs w:val="18"/>
+        </w:rPr>
+        <w:t xml:space="preserve">) </w:t>
+      </w:r>
+      <w:r>
+        <w:rPr>
+          <w:i/>
+          <w:iCs/>
+          <w:sz w:val="18"/>
+          <w:szCs w:val="18"/>
+        </w:rPr>
+        <w:t xml:space="preserve"> in</w:t>
+      </w:r>
+      <w:proofErr w:type="gramEnd"/>
+      <w:r>
+        <w:rPr>
+          <w:i/>
+          <w:iCs/>
+          <w:sz w:val="18"/>
+          <w:szCs w:val="18"/>
+        </w:rPr>
+        <w:t xml:space="preserve"> Computer Science, APJ Abdul Kalam Technological University (KTU)</w:t>
       </w:r>
     </w:p>
     <w:p>
@@ -259,37 +355,46 @@
           <w:b/>
           <w:bCs/>
         </w:rPr>
-        <w:t xml:space="preserve">Languages: </w:t>
-      </w:r>
-      <w:r>
-        <w:t>Java (17, 21), SQL, JavaScript, Python, HTML5, CSS3, C, C++ (basics)</w:t>
-      </w:r>
-    </w:p>
-    <w:p>
+        <w:t>Languages:</w:t>
+      </w:r>
+      <w:r>
+        <w:t xml:space="preserve"> Java (17, 21</w:t>
+      </w:r>
+      <w:r>
+        <w:t>, 25</w:t>
+      </w:r>
+      <w:r>
+        <w:t>), SQL, JavaScript (ES6+), Python, C/C++ (basics)</w:t>
+      </w:r>
+      <w:r>
+        <w:br/>
+      </w:r>
       <w:r>
         <w:rPr>
           <w:b/>
           <w:bCs/>
         </w:rPr>
-        <w:t xml:space="preserve">Backend &amp; Frameworks: </w:t>
-      </w:r>
-      <w:r>
-        <w:t>Spring Boot, Spring MVC, Spring Security, Spring Data JPA, Hibernate, Spring JDBC, RESTful APIs, JWT Authentication, Session-Based Authentication</w:t>
-      </w:r>
-    </w:p>
-    <w:p>
+        <w:t>Backend &amp; Frameworks:</w:t>
+      </w:r>
+      <w:r>
+        <w:t xml:space="preserve"> Spring Boot, Spring MVC, Spring Security, Spring Data JPA, Hibernate, Spring JDBC, RESTful APIs, JWT, Session-Based Authentication</w:t>
+      </w:r>
+      <w:r>
+        <w:br/>
+      </w:r>
       <w:r>
         <w:rPr>
           <w:b/>
           <w:bCs/>
         </w:rPr>
-        <w:t xml:space="preserve">Frontend: </w:t>
-      </w:r>
-      <w:r>
-        <w:t>React, JavaScript (ES6+), Tailwind CSS, Bootstrap, Responsive Design, Vite</w:t>
-      </w:r>
-    </w:p>
-    <w:p>
+        <w:t>Frontend:</w:t>
+      </w:r>
+      <w:r>
+        <w:t xml:space="preserve"> React, HTML5, CSS3, Tailwind CSS, Bootstrap, Vite</w:t>
+      </w:r>
+      <w:r>
+        <w:br/>
+      </w:r>
       <w:r>
         <w:rPr>
           <w:b/>
@@ -300,41 +405,34 @@
       <w:r>
         <w:t xml:space="preserve"> PostgreSQL, MySQL, Redis</w:t>
       </w:r>
-    </w:p>
-    <w:p>
+      <w:r>
+        <w:br/>
+      </w:r>
       <w:r>
         <w:rPr>
           <w:b/>
           <w:bCs/>
         </w:rPr>
-        <w:t xml:space="preserve">Tools &amp; Platforms: </w:t>
-      </w:r>
-      <w:r>
-        <w:t>Git, GitHub, Maven, Docker, Docker Compose, VS Code, Postman</w:t>
-      </w:r>
-    </w:p>
-    <w:p>
+        <w:t>Tools &amp; Platforms:</w:t>
+      </w:r>
+      <w:r>
+        <w:t xml:space="preserve"> Git, GitHub, Maven, Docker, Docker Compose, Postman, IntelliJ IDEA, VS Code</w:t>
+      </w:r>
+      <w:r>
+        <w:br/>
+      </w:r>
       <w:r>
         <w:rPr>
           <w:b/>
           <w:bCs/>
         </w:rPr>
-        <w:t xml:space="preserve">Concepts: </w:t>
-      </w:r>
-      <w:r>
-        <w:t>Object-Oriented Programming, REST Principles, Role-Based Access Control, ORM, Optimistic Locking, Stateless Authentication, Caching</w:t>
-      </w:r>
-    </w:p>
-    <w:p>
-      <w:r>
-        <w:rPr>
-          <w:b/>
-          <w:bCs/>
-        </w:rPr>
-        <w:t xml:space="preserve">Professional Skills: </w:t>
-      </w:r>
-      <w:r>
-        <w:t>Problem Solving, Active Listening, Team Collaboration, Communication, Event Coordination</w:t>
+        <w:t>Concepts:</w:t>
+      </w:r>
+      <w:r>
+        <w:t xml:space="preserve"> Object-Oriented Programming, Data Structures &amp; Algorithms, REST Principles, Role-Based Access Control, ORM, Optimistic Locking, Transaction Management, Caching</w:t>
+      </w:r>
+      <w:r>
+        <w:t>.</w:t>
       </w:r>
     </w:p>
     <w:p>
@@ -368,6 +466,7 @@
           <w:u w:val="single"/>
         </w:rPr>
       </w:pPr>
+      <w:proofErr w:type="spellStart"/>
       <w:r>
         <w:rPr>
           <w:b/>
@@ -376,8 +475,9 @@
           <w:szCs w:val="21"/>
           <w:u w:val="single"/>
         </w:rPr>
-        <w:t xml:space="preserve">StockSync   </w:t>
-      </w:r>
+        <w:t>StockSync</w:t>
+      </w:r>
+      <w:proofErr w:type="spellEnd"/>
       <w:r>
         <w:rPr>
           <w:b/>
@@ -386,16 +486,45 @@
           <w:szCs w:val="21"/>
           <w:u w:val="single"/>
         </w:rPr>
+        <w:t xml:space="preserve">   </w:t>
+      </w:r>
+      <w:r>
+        <w:rPr>
+          <w:b/>
+          <w:bCs/>
+          <w:sz w:val="21"/>
+          <w:szCs w:val="21"/>
+          <w:u w:val="single"/>
+        </w:rPr>
         <w:t>E-Commerce Order &amp; Inventory Engine</w:t>
       </w:r>
-    </w:p>
-    <w:p>
-      <w:pPr>
-        <w:pStyle w:val="ListParagraph"/>
+      <w:r>
+        <w:rPr>
+          <w:b/>
+          <w:bCs/>
+          <w:sz w:val="21"/>
+          <w:szCs w:val="21"/>
+          <w:u w:val="single"/>
+        </w:rPr>
+        <w:t xml:space="preserve"> </w:t>
+      </w:r>
+      <w:r>
+        <w:rPr>
+          <w:b/>
+          <w:bCs/>
+          <w:sz w:val="21"/>
+          <w:szCs w:val="21"/>
+          <w:u w:val="single"/>
+        </w:rPr>
+        <w:t>| GitHub: [link]</w:t>
+      </w:r>
+    </w:p>
+    <w:p>
+      <w:pPr>
         <w:keepNext/>
         <w:numPr>
           <w:ilvl w:val="0"/>
-          <w:numId w:val="10"/>
+          <w:numId w:val="14"/>
         </w:numPr>
         <w:tabs>
           <w:tab w:val="right" w:pos="10466"/>
@@ -404,16 +533,15 @@
         <w:jc w:val="both"/>
       </w:pPr>
       <w:r>
-        <w:t>Built a full-stack e-commerce application with a React storefront and Spring Boot REST API for product browsing, authentication, and order placement.</w:t>
-      </w:r>
-    </w:p>
-    <w:p>
-      <w:pPr>
-        <w:pStyle w:val="ListParagraph"/>
+        <w:t>Built a full-stack e-commerce app with a React storefront and a Spring Boot REST API covering product browsing, registration and login, and order placement.</w:t>
+      </w:r>
+    </w:p>
+    <w:p>
+      <w:pPr>
         <w:keepNext/>
         <w:numPr>
           <w:ilvl w:val="0"/>
-          <w:numId w:val="10"/>
+          <w:numId w:val="14"/>
         </w:numPr>
         <w:tabs>
           <w:tab w:val="right" w:pos="10466"/>
@@ -422,16 +550,15 @@
         <w:jc w:val="both"/>
       </w:pPr>
       <w:r>
-        <w:t>Implemented transactional checkout with PostgreSQL and optimistic locking to detect competing stock updates and prevent inventory from being oversold.</w:t>
-      </w:r>
-    </w:p>
-    <w:p>
-      <w:pPr>
-        <w:pStyle w:val="ListParagraph"/>
+        <w:t>Implemented transactional order placement with PostgreSQL and optimistic locking (versioned stock updates) to detect conflicting purchases and prevent overselling.</w:t>
+      </w:r>
+    </w:p>
+    <w:p>
+      <w:pPr>
         <w:keepNext/>
         <w:numPr>
           <w:ilvl w:val="0"/>
-          <w:numId w:val="10"/>
+          <w:numId w:val="14"/>
         </w:numPr>
         <w:tabs>
           <w:tab w:val="right" w:pos="10466"/>
@@ -440,16 +567,31 @@
         <w:jc w:val="both"/>
       </w:pPr>
       <w:r>
-        <w:t>Added JWT-based stateless authentication, Redis caching for the product catalog, and Docker Compose configuration for local services.</w:t>
-      </w:r>
-    </w:p>
-    <w:p>
-      <w:pPr>
-        <w:pStyle w:val="ListParagraph"/>
+        <w:t xml:space="preserve">Secured the API with Spring Security, stateless JWT authentication and </w:t>
+      </w:r>
+      <w:proofErr w:type="spellStart"/>
+      <w:r>
+        <w:t>BCrypt</w:t>
+      </w:r>
+      <w:proofErr w:type="spellEnd"/>
+      <w:r>
+        <w:t xml:space="preserve"> password hashing; cached the product </w:t>
+      </w:r>
+      <w:proofErr w:type="spellStart"/>
+      <w:r>
+        <w:t>catalog</w:t>
+      </w:r>
+      <w:proofErr w:type="spellEnd"/>
+      <w:r>
+        <w:t xml:space="preserve"> in Redis and containerized the stack with Docker Compose.</w:t>
+      </w:r>
+    </w:p>
+    <w:p>
+      <w:pPr>
         <w:keepNext/>
         <w:numPr>
           <w:ilvl w:val="0"/>
-          <w:numId w:val="10"/>
+          <w:numId w:val="14"/>
         </w:numPr>
         <w:tabs>
           <w:tab w:val="right" w:pos="10466"/>
@@ -458,7 +600,11 @@
         <w:jc w:val="both"/>
       </w:pPr>
       <w:r>
-        <w:t>Technologies: Java 21, Spring Boot, Spring Security, Spring Data JPA, React, Tailwind CSS, PostgreSQL, Redis, Docker, JWT.</w:t>
+        <w:rPr>
+          <w:i/>
+          <w:iCs/>
+        </w:rPr>
+        <w:t>Technologies: Java 21, Spring Boot, Spring Security, Spring Data JPA, React, Tailwind CSS, PostgreSQL, Redis, Docker, JWT</w:t>
       </w:r>
     </w:p>
     <w:p>
@@ -487,14 +633,33 @@
         </w:rPr>
         <w:t>Digital Library System</w:t>
       </w:r>
-    </w:p>
-    <w:p>
-      <w:pPr>
-        <w:pStyle w:val="ListParagraph"/>
+      <w:r>
+        <w:rPr>
+          <w:b/>
+          <w:bCs/>
+          <w:sz w:val="21"/>
+          <w:szCs w:val="21"/>
+          <w:u w:val="single"/>
+        </w:rPr>
+        <w:t xml:space="preserve"> </w:t>
+      </w:r>
+      <w:r>
+        <w:rPr>
+          <w:b/>
+          <w:bCs/>
+          <w:sz w:val="21"/>
+          <w:szCs w:val="21"/>
+          <w:u w:val="single"/>
+        </w:rPr>
+        <w:t>| GitHub: [link]</w:t>
+      </w:r>
+    </w:p>
+    <w:p>
+      <w:pPr>
         <w:keepNext/>
         <w:numPr>
           <w:ilvl w:val="0"/>
-          <w:numId w:val="13"/>
+          <w:numId w:val="15"/>
         </w:numPr>
         <w:tabs>
           <w:tab w:val="right" w:pos="10466"/>
@@ -503,16 +668,21 @@
         <w:jc w:val="both"/>
       </w:pPr>
       <w:r>
-        <w:t>Built a digital library system with searchable, category-filtered book catalogues and separate administrator and member experiences.</w:t>
-      </w:r>
-    </w:p>
-    <w:p>
-      <w:pPr>
-        <w:pStyle w:val="ListParagraph"/>
+        <w:t>Built a library management web app with Spring Boot and Spring JDBC (</w:t>
+      </w:r>
+      <w:r>
+        <w:t xml:space="preserve">JDBC </w:t>
+      </w:r>
+      <w:r>
+        <w:t>Template) on PostgreSQL, with separate member and administrator roles, session-based authentication and a searchable, category-filtered book catalogue.</w:t>
+      </w:r>
+    </w:p>
+    <w:p>
+      <w:pPr>
         <w:keepNext/>
         <w:numPr>
           <w:ilvl w:val="0"/>
-          <w:numId w:val="13"/>
+          <w:numId w:val="15"/>
         </w:numPr>
         <w:tabs>
           <w:tab w:val="right" w:pos="10466"/>
@@ -521,16 +691,15 @@
         <w:jc w:val="both"/>
       </w:pPr>
       <w:r>
-        <w:t>Implemented account registration and login, catalogue and member management, book checkout and return, and contact message handling.</w:t>
-      </w:r>
-    </w:p>
-    <w:p>
-      <w:pPr>
-        <w:pStyle w:val="ListParagraph"/>
+        <w:t>Implemented transactional checkout, return and FIFO reservation logic that keeps book inventory consistent, with 14-day due dates and automatic ₹5/day overdue fines.</w:t>
+      </w:r>
+    </w:p>
+    <w:p>
+      <w:pPr>
         <w:keepNext/>
         <w:numPr>
           <w:ilvl w:val="0"/>
-          <w:numId w:val="13"/>
+          <w:numId w:val="15"/>
         </w:numPr>
         <w:tabs>
           <w:tab w:val="right" w:pos="10466"/>
@@ -539,16 +708,15 @@
         <w:jc w:val="both"/>
       </w:pPr>
       <w:r>
-        <w:t>Added 14-day due dates, ₹5-per-day overdue fines, inventory tracking, and FIFO reservations for unavailable books.</w:t>
-      </w:r>
-    </w:p>
-    <w:p>
-      <w:pPr>
-        <w:pStyle w:val="ListParagraph"/>
+        <w:t>Secured accounts with salted PBKDF2 password hashing, input validation and server-side role checks on admin endpoints; added member management and a contact-message inbox for administrators.</w:t>
+      </w:r>
+    </w:p>
+    <w:p>
+      <w:pPr>
         <w:keepNext/>
         <w:numPr>
           <w:ilvl w:val="0"/>
-          <w:numId w:val="13"/>
+          <w:numId w:val="15"/>
         </w:numPr>
         <w:tabs>
           <w:tab w:val="right" w:pos="10466"/>
@@ -557,7 +725,11 @@
         <w:jc w:val="both"/>
       </w:pPr>
       <w:r>
-        <w:t>Technologies: Java 17, Spring Boot, REST APIs, Spring JDBC, PostgreSQL, HTML, CSS, JavaScript, Maven, Docker.</w:t>
+        <w:rPr>
+          <w:i/>
+          <w:iCs/>
+        </w:rPr>
+        <w:t>Technologies: Java 17, Spring Boot, REST APIs, Spring JDBC, PostgreSQL, HTML, CSS, JavaScript, Maven, Docker</w:t>
       </w:r>
     </w:p>
     <w:p>
@@ -577,7 +749,7 @@
           <w:szCs w:val="21"/>
           <w:u w:val="single"/>
         </w:rPr>
-        <w:t>College Project Management System</w:t>
+        <w:t>AI Chatbot – Spring Boot + Google Gemini | GitHub: [link]</w:t>
       </w:r>
       <w:r>
         <w:rPr>
@@ -602,7 +774,15 @@
         <w:jc w:val="both"/>
       </w:pPr>
       <w:r>
-        <w:t>Developed a full-stack platform to streamline academic workflows with role-based access for students, guides, and coordinators.</w:t>
+        <w:t>Built a web chatbot with a Spring Boot REST endpoint (POST /</w:t>
+      </w:r>
+      <w:proofErr w:type="spellStart"/>
+      <w:r>
+        <w:t>api</w:t>
+      </w:r>
+      <w:proofErr w:type="spellEnd"/>
+      <w:r>
+        <w:t>/chat) that sends user messages to Google Gemini through the Google GenAI Java SDK and returns the reply to a browser chat UI.</w:t>
       </w:r>
     </w:p>
     <w:p>
@@ -620,7 +800,7 @@
         <w:jc w:val="both"/>
       </w:pPr>
       <w:r>
-        <w:t>Built robust RESTful APIs using Spring Boot, leveraging Spring Data JPA and MySQL for efficient database management.</w:t>
+        <w:t>Added server-side input validation (non-empty messages, 8,000-character limit) and structured JSON error responses.</w:t>
       </w:r>
     </w:p>
     <w:p>
@@ -638,7 +818,39 @@
         <w:jc w:val="both"/>
       </w:pPr>
       <w:r>
-        <w:t xml:space="preserve">Implemented core functionality including automated team allocation, project diary tracking, and secure document uploads </w:t>
+        <w:t>Implemented retry handling for temporary Gemini API failure</w:t>
+      </w:r>
+      <w:r>
+        <w:t>s</w:t>
+      </w:r>
+      <w:r>
+        <w:t xml:space="preserve"> (HTTP 429 and 503) to Improve Reliability.</w:t>
+      </w:r>
+    </w:p>
+    <w:p>
+      <w:pPr>
+        <w:pStyle w:val="ListParagraph"/>
+        <w:keepNext/>
+        <w:numPr>
+          <w:ilvl w:val="0"/>
+          <w:numId w:val="9"/>
+        </w:numPr>
+        <w:tabs>
+          <w:tab w:val="right" w:pos="10466"/>
+        </w:tabs>
+        <w:spacing w:before="60" w:line="240" w:lineRule="auto"/>
+        <w:jc w:val="both"/>
+        <w:rPr>
+          <w:i/>
+          <w:iCs/>
+        </w:rPr>
+      </w:pPr>
+      <w:r>
+        <w:rPr>
+          <w:i/>
+          <w:iCs/>
+        </w:rPr>
+        <w:t>Technologies: Java, Spring Boot, Google GenAI SDK, REST APIs, HTML, CSS, JavaScript, Maven</w:t>
       </w:r>
     </w:p>
     <w:p>
@@ -835,7 +1047,15 @@
         </w:numPr>
       </w:pPr>
       <w:r>
-        <w:t>Developed Python scripts and small applications for automation and data-handling exercises under mentorship.</w:t>
+        <w:t xml:space="preserve">Developed Python scripts and small applications for automation and data-handling </w:t>
+      </w:r>
+      <w:proofErr w:type="gramStart"/>
+      <w:r>
+        <w:t>exercises</w:t>
+      </w:r>
+      <w:proofErr w:type="gramEnd"/>
+      <w:r>
+        <w:t xml:space="preserve"> under mentorship.</w:t>
       </w:r>
     </w:p>
     <w:p>
@@ -846,6 +1066,7 @@
         </w:tabs>
         <w:spacing w:before="60"/>
       </w:pPr>
+      <w:proofErr w:type="spellStart"/>
       <w:r>
         <w:rPr>
           <w:b/>
@@ -853,7 +1074,17 @@
           <w:sz w:val="21"/>
           <w:szCs w:val="21"/>
         </w:rPr>
-        <w:t>Stentorx Integrated Communication</w:t>
+        <w:t>Stentorx</w:t>
+      </w:r>
+      <w:proofErr w:type="spellEnd"/>
+      <w:r>
+        <w:rPr>
+          <w:b/>
+          <w:bCs/>
+          <w:sz w:val="21"/>
+          <w:szCs w:val="21"/>
+        </w:rPr>
+        <w:t xml:space="preserve"> Integrated Communication</w:t>
       </w:r>
       <w:r>
         <w:rPr>
@@ -862,7 +1093,7 @@
           <w:sz w:val="18"/>
           <w:szCs w:val="18"/>
         </w:rPr>
-        <w:t xml:space="preserve">  </w:t>
+        <w:t xml:space="preserve"> </w:t>
       </w:r>
       <w:r>
         <w:rPr>
@@ -880,7 +1111,7 @@
           <w:sz w:val="18"/>
           <w:szCs w:val="18"/>
         </w:rPr>
-        <w:t xml:space="preserve">  Web Development Intern</w:t>
+        <w:t xml:space="preserve"> Web Development Intern</w:t>
       </w:r>
       <w:r>
         <w:rPr>
@@ -1668,6 +1899,155 @@
     </w:lvl>
   </w:abstractNum>
   <w:abstractNum w:abstractNumId="6" w15:restartNumberingAfterBreak="0">
+    <w:nsid w:val="3CE00D9C"/>
+    <w:multiLevelType w:val="multilevel"/>
+    <w:tmpl w:val="A73C53E8"/>
+    <w:lvl w:ilvl="0">
+      <w:start w:val="1"/>
+      <w:numFmt w:val="bullet"/>
+      <w:lvlText w:val=""/>
+      <w:lvlJc w:val="left"/>
+      <w:pPr>
+        <w:tabs>
+          <w:tab w:val="num" w:pos="720"/>
+        </w:tabs>
+        <w:ind w:left="720" w:hanging="360"/>
+      </w:pPr>
+      <w:rPr>
+        <w:rFonts w:ascii="Symbol" w:hAnsi="Symbol" w:hint="default"/>
+        <w:sz w:val="20"/>
+      </w:rPr>
+    </w:lvl>
+    <w:lvl w:ilvl="1" w:tentative="1">
+      <w:start w:val="1"/>
+      <w:numFmt w:val="bullet"/>
+      <w:lvlText w:val="o"/>
+      <w:lvlJc w:val="left"/>
+      <w:pPr>
+        <w:tabs>
+          <w:tab w:val="num" w:pos="1440"/>
+        </w:tabs>
+        <w:ind w:left="1440" w:hanging="360"/>
+      </w:pPr>
+      <w:rPr>
+        <w:rFonts w:ascii="Courier New" w:hAnsi="Courier New" w:hint="default"/>
+        <w:sz w:val="20"/>
+      </w:rPr>
+    </w:lvl>
+    <w:lvl w:ilvl="2" w:tentative="1">
+      <w:start w:val="1"/>
+      <w:numFmt w:val="bullet"/>
+      <w:lvlText w:val=""/>
+      <w:lvlJc w:val="left"/>
+      <w:pPr>
+        <w:tabs>
+          <w:tab w:val="num" w:pos="2160"/>
+        </w:tabs>
+        <w:ind w:left="2160" w:hanging="360"/>
+      </w:pPr>
+      <w:rPr>
+        <w:rFonts w:ascii="Wingdings" w:hAnsi="Wingdings" w:hint="default"/>
+        <w:sz w:val="20"/>
+      </w:rPr>
+    </w:lvl>
+    <w:lvl w:ilvl="3" w:tentative="1">
+      <w:start w:val="1"/>
+      <w:numFmt w:val="bullet"/>
+      <w:lvlText w:val=""/>
+      <w:lvlJc w:val="left"/>
+      <w:pPr>
+        <w:tabs>
+          <w:tab w:val="num" w:pos="2880"/>
+        </w:tabs>
+        <w:ind w:left="2880" w:hanging="360"/>
+      </w:pPr>
+      <w:rPr>
+        <w:rFonts w:ascii="Wingdings" w:hAnsi="Wingdings" w:hint="default"/>
+        <w:sz w:val="20"/>
+      </w:rPr>
+    </w:lvl>
+    <w:lvl w:ilvl="4" w:tentative="1">
+      <w:start w:val="1"/>
+      <w:numFmt w:val="bullet"/>
+      <w:lvlText w:val=""/>
+      <w:lvlJc w:val="left"/>
+      <w:pPr>
+        <w:tabs>
+          <w:tab w:val="num" w:pos="3600"/>
+        </w:tabs>
+        <w:ind w:left="3600" w:hanging="360"/>
+      </w:pPr>
+      <w:rPr>
+        <w:rFonts w:ascii="Wingdings" w:hAnsi="Wingdings" w:hint="default"/>
+        <w:sz w:val="20"/>
+      </w:rPr>
+    </w:lvl>
+    <w:lvl w:ilvl="5" w:tentative="1">
+      <w:start w:val="1"/>
+      <w:numFmt w:val="bullet"/>
+      <w:lvlText w:val=""/>
+      <w:lvlJc w:val="left"/>
+      <w:pPr>
+        <w:tabs>
+          <w:tab w:val="num" w:pos="4320"/>
+        </w:tabs>
+        <w:ind w:left="4320" w:hanging="360"/>
+      </w:pPr>
+      <w:rPr>
+        <w:rFonts w:ascii="Wingdings" w:hAnsi="Wingdings" w:hint="default"/>
+        <w:sz w:val="20"/>
+      </w:rPr>
+    </w:lvl>
+    <w:lvl w:ilvl="6" w:tentative="1">
+      <w:start w:val="1"/>
+      <w:numFmt w:val="bullet"/>
+      <w:lvlText w:val=""/>
+      <w:lvlJc w:val="left"/>
+      <w:pPr>
+        <w:tabs>
+          <w:tab w:val="num" w:pos="5040"/>
+        </w:tabs>
+        <w:ind w:left="5040" w:hanging="360"/>
+      </w:pPr>
+      <w:rPr>
+        <w:rFonts w:ascii="Wingdings" w:hAnsi="Wingdings" w:hint="default"/>
+        <w:sz w:val="20"/>
+      </w:rPr>
+    </w:lvl>
+    <w:lvl w:ilvl="7" w:tentative="1">
+      <w:start w:val="1"/>
+      <w:numFmt w:val="bullet"/>
+      <w:lvlText w:val=""/>
+      <w:lvlJc w:val="left"/>
+      <w:pPr>
+        <w:tabs>
+          <w:tab w:val="num" w:pos="5760"/>
+        </w:tabs>
+        <w:ind w:left="5760" w:hanging="360"/>
+      </w:pPr>
+      <w:rPr>
+        <w:rFonts w:ascii="Wingdings" w:hAnsi="Wingdings" w:hint="default"/>
+        <w:sz w:val="20"/>
+      </w:rPr>
+    </w:lvl>
+    <w:lvl w:ilvl="8" w:tentative="1">
+      <w:start w:val="1"/>
+      <w:numFmt w:val="bullet"/>
+      <w:lvlText w:val=""/>
+      <w:lvlJc w:val="left"/>
+      <w:pPr>
+        <w:tabs>
+          <w:tab w:val="num" w:pos="6480"/>
+        </w:tabs>
+        <w:ind w:left="6480" w:hanging="360"/>
+      </w:pPr>
+      <w:rPr>
+        <w:rFonts w:ascii="Wingdings" w:hAnsi="Wingdings" w:hint="default"/>
+        <w:sz w:val="20"/>
+      </w:rPr>
+    </w:lvl>
+  </w:abstractNum>
+  <w:abstractNum w:abstractNumId="7" w15:restartNumberingAfterBreak="0">
     <w:nsid w:val="3F3F0D39"/>
     <w:multiLevelType w:val="hybridMultilevel"/>
     <w:tmpl w:val="08305C4C"/>
@@ -1753,7 +2133,7 @@
       </w:pPr>
     </w:lvl>
   </w:abstractNum>
-  <w:abstractNum w:abstractNumId="7" w15:restartNumberingAfterBreak="0">
+  <w:abstractNum w:abstractNumId="8" w15:restartNumberingAfterBreak="0">
     <w:nsid w:val="56FB181F"/>
     <w:multiLevelType w:val="hybridMultilevel"/>
     <w:tmpl w:val="45A6818E"/>
@@ -1866,7 +2246,7 @@
       </w:rPr>
     </w:lvl>
   </w:abstractNum>
-  <w:abstractNum w:abstractNumId="8" w15:restartNumberingAfterBreak="0">
+  <w:abstractNum w:abstractNumId="9" w15:restartNumberingAfterBreak="0">
     <w:nsid w:val="5C336572"/>
     <w:multiLevelType w:val="hybridMultilevel"/>
     <w:tmpl w:val="621668F4"/>
@@ -1979,7 +2359,7 @@
       </w:rPr>
     </w:lvl>
   </w:abstractNum>
-  <w:abstractNum w:abstractNumId="9" w15:restartNumberingAfterBreak="0">
+  <w:abstractNum w:abstractNumId="10" w15:restartNumberingAfterBreak="0">
     <w:nsid w:val="5F895488"/>
     <w:multiLevelType w:val="hybridMultilevel"/>
     <w:tmpl w:val="420C4E98"/>
@@ -2089,7 +2469,7 @@
       </w:rPr>
     </w:lvl>
   </w:abstractNum>
-  <w:abstractNum w:abstractNumId="10" w15:restartNumberingAfterBreak="0">
+  <w:abstractNum w:abstractNumId="11" w15:restartNumberingAfterBreak="0">
     <w:nsid w:val="63B8645E"/>
     <w:multiLevelType w:val="hybridMultilevel"/>
     <w:tmpl w:val="8356F8C8"/>
@@ -2143,7 +2523,7 @@
       <w:lvlJc w:val="left"/>
     </w:lvl>
   </w:abstractNum>
-  <w:abstractNum w:abstractNumId="11" w15:restartNumberingAfterBreak="0">
+  <w:abstractNum w:abstractNumId="12" w15:restartNumberingAfterBreak="0">
     <w:nsid w:val="64CE6E12"/>
     <w:multiLevelType w:val="hybridMultilevel"/>
     <w:tmpl w:val="01EAB766"/>
@@ -2253,14 +2633,163 @@
       </w:rPr>
     </w:lvl>
   </w:abstractNum>
+  <w:abstractNum w:abstractNumId="13" w15:restartNumberingAfterBreak="0">
+    <w:nsid w:val="71563F00"/>
+    <w:multiLevelType w:val="multilevel"/>
+    <w:tmpl w:val="32987500"/>
+    <w:lvl w:ilvl="0">
+      <w:start w:val="1"/>
+      <w:numFmt w:val="bullet"/>
+      <w:lvlText w:val=""/>
+      <w:lvlJc w:val="left"/>
+      <w:pPr>
+        <w:tabs>
+          <w:tab w:val="num" w:pos="720"/>
+        </w:tabs>
+        <w:ind w:left="720" w:hanging="360"/>
+      </w:pPr>
+      <w:rPr>
+        <w:rFonts w:ascii="Symbol" w:hAnsi="Symbol" w:hint="default"/>
+        <w:sz w:val="20"/>
+      </w:rPr>
+    </w:lvl>
+    <w:lvl w:ilvl="1" w:tentative="1">
+      <w:start w:val="1"/>
+      <w:numFmt w:val="bullet"/>
+      <w:lvlText w:val="o"/>
+      <w:lvlJc w:val="left"/>
+      <w:pPr>
+        <w:tabs>
+          <w:tab w:val="num" w:pos="1440"/>
+        </w:tabs>
+        <w:ind w:left="1440" w:hanging="360"/>
+      </w:pPr>
+      <w:rPr>
+        <w:rFonts w:ascii="Courier New" w:hAnsi="Courier New" w:hint="default"/>
+        <w:sz w:val="20"/>
+      </w:rPr>
+    </w:lvl>
+    <w:lvl w:ilvl="2" w:tentative="1">
+      <w:start w:val="1"/>
+      <w:numFmt w:val="bullet"/>
+      <w:lvlText w:val=""/>
+      <w:lvlJc w:val="left"/>
+      <w:pPr>
+        <w:tabs>
+          <w:tab w:val="num" w:pos="2160"/>
+        </w:tabs>
+        <w:ind w:left="2160" w:hanging="360"/>
+      </w:pPr>
+      <w:rPr>
+        <w:rFonts w:ascii="Wingdings" w:hAnsi="Wingdings" w:hint="default"/>
+        <w:sz w:val="20"/>
+      </w:rPr>
+    </w:lvl>
+    <w:lvl w:ilvl="3" w:tentative="1">
+      <w:start w:val="1"/>
+      <w:numFmt w:val="bullet"/>
+      <w:lvlText w:val=""/>
+      <w:lvlJc w:val="left"/>
+      <w:pPr>
+        <w:tabs>
+          <w:tab w:val="num" w:pos="2880"/>
+        </w:tabs>
+        <w:ind w:left="2880" w:hanging="360"/>
+      </w:pPr>
+      <w:rPr>
+        <w:rFonts w:ascii="Wingdings" w:hAnsi="Wingdings" w:hint="default"/>
+        <w:sz w:val="20"/>
+      </w:rPr>
+    </w:lvl>
+    <w:lvl w:ilvl="4" w:tentative="1">
+      <w:start w:val="1"/>
+      <w:numFmt w:val="bullet"/>
+      <w:lvlText w:val=""/>
+      <w:lvlJc w:val="left"/>
+      <w:pPr>
+        <w:tabs>
+          <w:tab w:val="num" w:pos="3600"/>
+        </w:tabs>
+        <w:ind w:left="3600" w:hanging="360"/>
+      </w:pPr>
+      <w:rPr>
+        <w:rFonts w:ascii="Wingdings" w:hAnsi="Wingdings" w:hint="default"/>
+        <w:sz w:val="20"/>
+      </w:rPr>
+    </w:lvl>
+    <w:lvl w:ilvl="5" w:tentative="1">
+      <w:start w:val="1"/>
+      <w:numFmt w:val="bullet"/>
+      <w:lvlText w:val=""/>
+      <w:lvlJc w:val="left"/>
+      <w:pPr>
+        <w:tabs>
+          <w:tab w:val="num" w:pos="4320"/>
+        </w:tabs>
+        <w:ind w:left="4320" w:hanging="360"/>
+      </w:pPr>
+      <w:rPr>
+        <w:rFonts w:ascii="Wingdings" w:hAnsi="Wingdings" w:hint="default"/>
+        <w:sz w:val="20"/>
+      </w:rPr>
+    </w:lvl>
+    <w:lvl w:ilvl="6" w:tentative="1">
+      <w:start w:val="1"/>
+      <w:numFmt w:val="bullet"/>
+      <w:lvlText w:val=""/>
+      <w:lvlJc w:val="left"/>
+      <w:pPr>
+        <w:tabs>
+          <w:tab w:val="num" w:pos="5040"/>
+        </w:tabs>
+        <w:ind w:left="5040" w:hanging="360"/>
+      </w:pPr>
+      <w:rPr>
+        <w:rFonts w:ascii="Wingdings" w:hAnsi="Wingdings" w:hint="default"/>
+        <w:sz w:val="20"/>
+      </w:rPr>
+    </w:lvl>
+    <w:lvl w:ilvl="7" w:tentative="1">
+      <w:start w:val="1"/>
+      <w:numFmt w:val="bullet"/>
+      <w:lvlText w:val=""/>
+      <w:lvlJc w:val="left"/>
+      <w:pPr>
+        <w:tabs>
+          <w:tab w:val="num" w:pos="5760"/>
+        </w:tabs>
+        <w:ind w:left="5760" w:hanging="360"/>
+      </w:pPr>
+      <w:rPr>
+        <w:rFonts w:ascii="Wingdings" w:hAnsi="Wingdings" w:hint="default"/>
+        <w:sz w:val="20"/>
+      </w:rPr>
+    </w:lvl>
+    <w:lvl w:ilvl="8" w:tentative="1">
+      <w:start w:val="1"/>
+      <w:numFmt w:val="bullet"/>
+      <w:lvlText w:val=""/>
+      <w:lvlJc w:val="left"/>
+      <w:pPr>
+        <w:tabs>
+          <w:tab w:val="num" w:pos="6480"/>
+        </w:tabs>
+        <w:ind w:left="6480" w:hanging="360"/>
+      </w:pPr>
+      <w:rPr>
+        <w:rFonts w:ascii="Wingdings" w:hAnsi="Wingdings" w:hint="default"/>
+        <w:sz w:val="20"/>
+      </w:rPr>
+    </w:lvl>
+  </w:abstractNum>
   <w:num w:numId="1" w16cid:durableId="847674591">
-    <w:abstractNumId w:val="6"/>
+    <w:abstractNumId w:val="7"/>
     <w:lvlOverride w:ilvl="0">
       <w:startOverride w:val="1"/>
     </w:lvlOverride>
   </w:num>
   <w:num w:numId="2" w16cid:durableId="559831852">
-    <w:abstractNumId w:val="10"/>
+    <w:abstractNumId w:val="11"/>
     <w:lvlOverride w:ilvl="0">
       <w:startOverride w:val="1"/>
     </w:lvlOverride>
@@ -2272,22 +2801,22 @@
     <w:abstractNumId w:val="0"/>
   </w:num>
   <w:num w:numId="5" w16cid:durableId="516962384">
-    <w:abstractNumId w:val="10"/>
+    <w:abstractNumId w:val="11"/>
   </w:num>
   <w:num w:numId="6" w16cid:durableId="515920815">
-    <w:abstractNumId w:val="8"/>
+    <w:abstractNumId w:val="9"/>
   </w:num>
   <w:num w:numId="7" w16cid:durableId="1706709032">
-    <w:abstractNumId w:val="11"/>
+    <w:abstractNumId w:val="12"/>
   </w:num>
   <w:num w:numId="8" w16cid:durableId="645011106">
     <w:abstractNumId w:val="3"/>
   </w:num>
   <w:num w:numId="9" w16cid:durableId="314379368">
-    <w:abstractNumId w:val="7"/>
+    <w:abstractNumId w:val="8"/>
   </w:num>
   <w:num w:numId="10" w16cid:durableId="2035618859">
-    <w:abstractNumId w:val="9"/>
+    <w:abstractNumId w:val="10"/>
   </w:num>
   <w:num w:numId="11" w16cid:durableId="271669981">
     <w:abstractNumId w:val="2"/>
@@ -2297,6 +2826,12 @@
   </w:num>
   <w:num w:numId="13" w16cid:durableId="1845431984">
     <w:abstractNumId w:val="4"/>
+  </w:num>
+  <w:num w:numId="14" w16cid:durableId="655720141">
+    <w:abstractNumId w:val="6"/>
+  </w:num>
+  <w:num w:numId="15" w16cid:durableId="1888639721">
+    <w:abstractNumId w:val="13"/>
   </w:num>
 </w:numbering>
 </file>

</xml_diff>